<commit_message>
Reorganize docxs, expand architecture docs, add sequence diagrams and v2 deck
- Rename docxs/ deliverables to drop numeric prefixes / clarify titles
- architecture-dataflow.docx: add registration, job-posting, resume
  download, and scheduled-refresh sequence flows (previously only
  covered the resume-upload path)
- architecture-high-level.docx + diagrams/high-level.png: reflect the
  Cognito post-confirmation group assignment, Step Functions error
  path (MarkFailedStep/NotifyErrorStep), presigned-GET download path,
  and CloudWatch monitoring layer that were missing from the diagram
- Add sequence-{registration,job-posting,download,refresh}.png diagrams
- Add project-presentation-v2.pptx, a redesigned 16-slide deck
- Fix README.md: reverse double-encoded (UTF-8 read as Windows-1252)
  mojibake in the architecture diagram, and document EventBridge/
  presigned-GET download which were implemented but undocumented

Co-Authored-By: Claude Sonnet 5 <noreply@anthropic.com>
</commit_message>
<xml_diff>
--- a/docxs/architecture-high-level.docx
+++ b/docxs/architecture-high-level.docx
@@ -35,7 +35,7 @@
       <w:r>
         <w:drawing>
           <wp:inline distT="0" distB="0" distL="0" distR="0">
-            <wp:extent cx="5905500" cy="3019425"/>
+            <wp:extent cx="5905500" cy="2960283"/>
             <wp:effectExtent t="0" r="0" b="0" l="0"/>
             <wp:docPr id="1" name="" descr="" title=""/>
             <wp:cNvGraphicFramePr>
@@ -60,7 +60,7 @@
                   <pic:spPr bwMode="auto">
                     <a:xfrm>
                       <a:off x="0" y="0"/>
-                      <a:ext cx="5905500" cy="3019425"/>
+                      <a:ext cx="5905500" cy="2960283"/>
                     </a:xfrm>
                     <a:prstGeom prst="rect">
                       <a:avLst/>
@@ -117,7 +117,7 @@
         <w:t xml:space="preserve">1. </w:t>
       </w:r>
       <w:r>
-        <w:t xml:space="preserve">Students and recruiters both authenticate through the same Amazon Cognito Hosted UI (implicit OAuth flow). Cognito issues an access token and ID token; the ID token's cognito:groups claim (students or recruiters) determines which dashboard the frontend routes the user to.</w:t>
+        <w:t xml:space="preserve">Students and recruiters self-register and log in through the same Cognito-backed sign-up/sign-in form. On confirmation, the cognitoPostConfirmation Lambda reads the role picked at sign-up and calls AdminAddUserToGroup to place the user in the students or recruiters Cognito group; Cognito then issues an access token and ID token whose cognito:groups claim determines which dashboard the frontend routes the user to on every subsequent request.</w:t>
       </w:r>
     </w:p>
     <w:p>
@@ -192,7 +192,7 @@
         <w:t xml:space="preserve">6. </w:t>
       </w:r>
       <w:r>
-        <w:t xml:space="preserve">The state machine runs three steps in sequence: extractText calls Amazon Textract to OCR the resume; parseScore reads current postings from JobsTable, calls the Hugging Face Inference API to score the resume against them, and writes the result (match score, skills, summary) to ResultsTable; notifyResult publishes a completion message to an Amazon SNS topic.</w:t>
+        <w:t xml:space="preserve">The state machine runs three steps in sequence: extractText calls Amazon Textract to OCR the resume; parseScore reads current postings from JobsTable, calls the Hugging Face Inference API to score the resume against them, and writes the result (match score, skills, summary) to ResultsTable; notifyResult publishes a completion message to an Amazon SNS topic. Each step retries transient failures and, on exhausting retries, a Catch transition routes to MarkFailedStep and NotifyErrorStep — both direct Step Functions service integrations (a DynamoDB UpdateItem and an SNS Publish) rather than dedicated Lambdas — so a failed analysis still marks the record status=failed and alerts the same SNS topic without extra compute.</w:t>
       </w:r>
     </w:p>
     <w:p>
@@ -207,7 +207,7 @@
         <w:t xml:space="preserve">7. </w:t>
       </w:r>
       <w:r>
-        <w:t xml:space="preserve">Students poll GET /results/{candidateId} for their own results; recruiters call GET /jobs/{jobId}/results, which queries the jobId-matchScore-index Global Secondary Index on ResultsTable to return candidates pre-sorted by score for that job, highest first.</w:t>
+        <w:t xml:space="preserve">Students poll GET /results/{candidateId} (or GET /my-results for their full history) and recruiters call GET /jobs/{jobId}/results, which queries the jobId-matchScore-index Global Secondary Index on ResultsTable to return candidates pre-sorted by score for that job, highest first. Both Lambdas also generate a short-lived S3 presigned GET URL for each result's resume, so the browser downloads the PDF directly from S3 rather than proxying the file through API Gateway.</w:t>
       </w:r>
     </w:p>
     <w:p>
@@ -223,6 +223,21 @@
       </w:r>
       <w:r>
         <w:t xml:space="preserve">An EventBridge rule on a 24-hour schedule invokes refreshJobs to seed a baseline set of job postings into JobsTable, running alongside (not instead of) live postings recruiters create through POST /jobs.</w:t>
+      </w:r>
+    </w:p>
+    <w:p>
+      <w:pPr>
+        <w:spacing w:after="80"/>
+      </w:pPr>
+      <w:r>
+        <w:rPr>
+          <w:b/>
+          <w:bCs/>
+        </w:rPr>
+        <w:t xml:space="preserve">9. </w:t>
+      </w:r>
+      <w:r>
+        <w:t xml:space="preserve">CloudWatch alarms watch Lambda Errors on all 8 core functions, Step Functions ExecutionsFailed, and DynamoDB ThrottledRequests on ResultsTable, all wired to the same resume-analysis-notifications SNS topic used for candidate result emails — so operational failures and application-level completion/failure notices surface through one channel.</w:t>
       </w:r>
     </w:p>
     <w:p>

</xml_diff>